<commit_message>
feat(db): migrate full stack to SQL Server 2022 (provider sqlserver, schema pull, .env, docker-compose, docs, remove equipment feature, fix face-embedding parse)
</commit_message>
<xml_diff>
--- a/docs/DienThuyet_GymShark.docx
+++ b/docs/DienThuyet_GymShark.docx
@@ -435,7 +435,7 @@
           <w:color w:val="1A1A1A"/>
           <w:sz w:val="22"/>
         </w:rPr>
-        <w:t xml:space="preserve">• </w:t>
+        <w:t>• Backend: NestJS + Prisma + SQL Server 2022 (`gym_db`). Nest cung cấp module hóa rõ ràng; Prisma sinh truy vấn có kiểu an toàn; SQL Server hỗ trợ transaction cho nghiệp vụ.</w:t>
       </w:r>
       <w:r>
         <w:rPr>
@@ -445,17 +445,15 @@
           <w:color w:val="1A1A1A"/>
           <w:sz w:val="22"/>
         </w:rPr>
-        <w:t>Backend</w:t>
-      </w:r>
-      <w:r>
-        <w:rPr>
-          <w:rFonts w:hint="default" w:ascii="Times New Roman" w:hAnsi="Times New Roman" w:cs="Times New Roman"/>
-          <w:b w:val="0"/>
-          <w:i w:val="0"/>
-          <w:color w:val="1A1A1A"/>
-          <w:sz w:val="22"/>
-        </w:rPr>
-        <w:t>: NestJS (Nest + Prisma + PostgreSQL 17 native). Nest cung cấp module hóa rõ ràng; Prisma giúp truy vấn an toàn, không cần viết SQL thô; PostgreSQL 17 đảm bảo tính nhất quán dữ liệu.</w:t>
+      </w:r>
+      <w:r>
+        <w:rPr>
+          <w:rFonts w:hint="default" w:ascii="Times New Roman" w:hAnsi="Times New Roman" w:cs="Times New Roman"/>
+          <w:b w:val="0"/>
+          <w:i w:val="0"/>
+          <w:color w:val="1A1A1A"/>
+          <w:sz w:val="22"/>
+        </w:rPr>
       </w:r>
     </w:p>
     <w:p>
@@ -629,7 +627,7 @@
           <w:color w:val="1A1A1A"/>
           <w:sz w:val="22"/>
         </w:rPr>
-        <w:t>• Client (Next) → API Gateway (Nest) → PostgreSQL</w:t>
+        <w:t>• Client (Next) → API Gateway (Nest) → SQL Server</w:t>
       </w:r>
     </w:p>
     <w:p>
@@ -4237,7 +4235,7 @@
           <w:color w:val="1A1A1A"/>
           <w:sz w:val="22"/>
         </w:rPr>
-        <w:t>"Dự án đã hoàn thành các yêu cầu cốt lõi: quản lý hội viên, thanh toán, thực đơn, check-in, báo cáo, audit, và giao tiếp thực thời. Tôi đã dùng PostgreSQL 17 native (không SQL Server), Next.js 14 + NestJS đầy tính năng, và tuân thủ palette thiết kế duy nhất.</w:t>
+        <w:t>"Dự án đã hoàn thành các yêu cầu cốt lõi: quản lý hội viên, thanh toán, thực đơn, check-in, báo cáo, audit, và giao tiếp thực thời. Backend dùng SQL Server 2022, Next.js 14 + NestJS đầy tính năng, và tuân thủ palette thiết kế duy nhất.</w:t>
       </w:r>
     </w:p>
     <w:p>
@@ -4564,7 +4562,7 @@
           <w:color w:val="1A1A1A"/>
           <w:sz w:val="22"/>
         </w:rPr>
-        <w:t>4. Kiến trúc: Next 14 + NestJS + PostgreSQL</w:t>
+        <w:t>4. Kiến trúc: Next 14 + NestJS + SQL Server</w:t>
       </w:r>
     </w:p>
     <w:p>

</xml_diff>